<commit_message>
Oficios a la Contraloría: ajustes de la segunda ronda de revisión y nota interna ampliada
- Fórmula prudente y uniforme sobre ausencia de detrimento patrimonial
  (Ley 610 de 2000 art. 6, D.L. 403 de 2020 art. 126) y solicitud común.
- 983: razón del error en la casilla SIN OFERTAS; estatuto de rentas
  vigente en la fecha del hecho generador; una sola consulta a Hacienda.
- 1058: exclusión del artículo 340 sometida a concepto; Tasa Prodeporte.
- 1056: pago único sin citar la póliza; defensa registral sin reserva de
  saneamiento; advertencia expresa sobre la fecha del contrato privado;
  acta de verificación y cierre con salvedad; literal h) reescrito.
- Nota interna: líneas rojas, pendientes por contrato y riesgos.

Co-Authored-By: Claude Fable 5.1 <noreply@anthropic.com>
Claude-Session: https://claude.ai/code/session_01P5p7QGF2DrrAGF6opUCb94
</commit_message>
<xml_diff>
--- a/caso-contraloria-ese-hrc/Nota interna - Pendientes antes de radicar (7 oct 2026).docx
+++ b/caso-contraloria-ese-hrc/Nota interna - Pendientes antes de radicar (7 oct 2026).docx
@@ -35,7 +35,7 @@
         <w:jc w:val="both"/>
       </w:pPr>
       <w:r>
-        <w:t>Se entrega un oficio único de respuesta con un capítulo por contrato (I: 983, II: 1058, III: 1056), consideración final y solicitud comunes, y además los tres oficios separados con el mismo contenido. Si los tres capítulos están listos hoy, se radica el oficio único. Si el capítulo del 1056 no alcanza (certificado de tradición, acta de recibo, certificación de la supervisora), se radican hoy los oficios del 983 y del 1058 y una comunicación de una página que anuncie la fecha de entrega del 1056; la no atención de un requerimiento es sancionable (Ley 42 de 1993, artículos 100 y 101). Todo por la Ventanilla Única de Correspondencia, con atención a la auditora designada.</w:t>
+        <w:t>Documento principal: oficio único de respuesta con un capítulo por contrato (I: 983, II: 1058, III: 1056), consideración final y solicitud comunes. Alternativa: los tres oficios separados con el mismo contenido. Las 72 horas hábiles pedidas el viernes 2 de octubre vencen el 6 o el 7 según el cómputo. Si el oficio completo con sus anexos firmados no se radica hoy por la Ventanilla Única, radicar hoy una comunicación de una página que informe la fecha cierta de entrega citando el radicado de la solicitud de plazo (Ley 42 de 1993, artículos 100 y 101). No radicar el oficio diciendo "se anexa" de documentos que no existen firmados; la comunicación de fecha cierta es preferible a promesas en futuro.</w:t>
       </w:r>
     </w:p>
     <w:p>
@@ -43,7 +43,7 @@
         <w:jc w:val="both"/>
       </w:pPr>
       <w:r>
-        <w:t>Los fragmentos resaltados en amarillo son marcadores internos. Deben resolverse y retirarse antes de radicar. Ninguno puede quedar en el texto.</w:t>
+        <w:t>Los fragmentos resaltados en amarillo son marcadores internos: decisiones, verificaciones y textos alternativos. Deben resolverse y retirarse antes de radicar. Ninguno puede quedar en el texto. Buscar y eliminar además las expresiones "en su estado original", "incumplimiento", "bien distinto al contratado", "diferencia de valor", "sobrecosto", "usado", "anticipado" y "antes de la entrega".</w:t>
       </w:r>
     </w:p>
     <w:p>
@@ -72,7 +72,7 @@
         <w:jc w:val="both"/>
       </w:pPr>
       <w:r>
-        <w:t>No se marcan casillas ni se añaden firmas a documentos ya suscritos (formato PL-FO-13 del 22 de enero de 2026, acta de aprobación de pólizas, formatos de supervisión). Lo que falte se certifica hoy en documento aparte con fecha actual.</w:t>
+        <w:t>No se marcan casillas ni se añaden firmas a documentos ya suscritos (PL-FO-12, PL-FO-13 del 22 de enero de 2026, FCAF-55, informes GJ-FO-01 y GJ-FO-02, acta de aprobación de pólizas, comunicación del 5 de octubre de 2026, contrato Colón–Import Medical). Lo que falte se certifica hoy en documento aparte con fecha actual.</w:t>
       </w:r>
     </w:p>
     <w:p>
@@ -81,7 +81,7 @@
         <w:jc w:val="both"/>
       </w:pPr>
       <w:r>
-        <w:t>No se afirma nada que el expediente no soporte: habilitación de la ambulancia en el REPS, idoneidad de la lámpara, quién pagó el SOAT de 2026, numeración de las causales del Manual, existencia de actas de recibo.</w:t>
+        <w:t>No se afirma nada que el expediente no soporte: habilitación de la ambulancia en el REPS, idoneidad de la lámpara sin inspección física, quién pagó el SOAT de 2026, numeración de las causales del Manual, kilometraje, existencia de actas de recibo.</w:t>
       </w:r>
     </w:p>
     <w:p>
@@ -95,13 +95,22 @@
     </w:p>
     <w:p>
       <w:pPr>
+        <w:pStyle w:val="ListBullet"/>
+        <w:jc w:val="both"/>
+      </w:pPr>
+      <w:r>
+        <w:t>Toda reclamación a un contratista se hace por oficio de Gerencia con constancia de recibo y fecha anterior a la del oficio a la Contraloría, para poder citarla.</w:t>
+      </w:r>
+    </w:p>
+    <w:p>
+      <w:pPr>
         <w:spacing w:before="200"/>
       </w:pPr>
       <w:r>
         <w:rPr>
           <w:b/>
         </w:rPr>
-        <w:t>3. Documentos por obtener o corregir hoy – Contrato 983</w:t>
+        <w:t>3. Contrato 983 – por obtener o corregir hoy</w:t>
       </w:r>
     </w:p>
     <w:p>
@@ -110,7 +119,7 @@
         <w:jc w:val="both"/>
       </w:pPr>
       <w:r>
-        <w:t>Firmar hoy la certificación de hechos de los días 2 y 3 de octubre de 2025 (proponente y líder de contratación); anexar, si existe, el correo del 2 de octubre de 2025 con el que se remitió el informe de evaluación.</w:t>
+        <w:t>Firmar hoy la certificación de hechos de los días 2 y 3 de octubre de 2025 (proponente y Líder de Contratación); anexar, si existe, el correo del 2 de octubre de 2025 con el que se remitió el informe de evaluación.</w:t>
       </w:r>
     </w:p>
     <w:p>
@@ -146,7 +155,7 @@
         <w:jc w:val="both"/>
       </w:pPr>
       <w:r>
-        <w:t>Conseguir: estudio previo, invitación N° 017, propuesta, acta de cierre, informe de evaluación, CDP 1329 y RP, designación de la supervisora, factura FE-2920, comprobante FCAF-53, relación de equipos con seriales y sede. Si falta alguno, ajustar el literal correspondiente para no afirmar que se anexa.</w:t>
+        <w:t>Conseguir: estudio previo, invitación N° 017, propuesta, acta de cierre, informe de evaluación, CDP 1329 y RP, designación de la supervisora, factura FE-2920, comprobante FCAF-53, relación de equipos con seriales y sede. Si falta alguno, ajustar el literal para no afirmar que se anexa.</w:t>
       </w:r>
     </w:p>
     <w:p>
@@ -155,7 +164,7 @@
         <w:jc w:val="both"/>
       </w:pPr>
       <w:r>
-        <w:t>Estampillas: confirmar con la Secretaría de Hacienda el estatuto vigente en octubre de 2025 y decidir quién asume los valores no retenidos. No aceptar estampillas concretas en el oficio.</w:t>
+        <w:t>Estampillas: radicar hoy una sola consulta a la Secretaría de Hacienda departamental para los contratos 983 y 1058 (que internamente cubra también el 1056, donde sí se descontaron estampilla y tasa) y citar su radicado en 983 k) y 1058 e). No pagar ni reintegrar nada antes del concepto.</w:t>
       </w:r>
     </w:p>
     <w:p>
@@ -166,7 +175,7 @@
         <w:rPr>
           <w:b/>
         </w:rPr>
-        <w:t>4. Documentos por obtener o corregir hoy – Contrato 1058</w:t>
+        <w:t>4. Contrato 1058 – por obtener o corregir hoy</w:t>
       </w:r>
     </w:p>
     <w:p>
@@ -211,7 +220,7 @@
         <w:jc w:val="both"/>
       </w:pPr>
       <w:r>
-        <w:t>Verificar en la Ordenanza 018 de 2025 si la Tasa Prodeporte tiene exclusión propia y si los valores descontados ya se trasladaron al Departamento.</w:t>
+        <w:t>Transcribir en e) el supuesto exacto del numeral 4 del artículo 340 de la Ordenanza 018 de 2025 y verificar si los valores descontados ya se trasladaron al Departamento.</w:t>
       </w:r>
     </w:p>
     <w:p>
@@ -222,7 +231,7 @@
         <w:rPr>
           <w:b/>
         </w:rPr>
-        <w:t>5. Documentos por obtener o corregir hoy – Contrato 1056</w:t>
+        <w:t>5. Contrato 1056 – por obtener o corregir hoy</w:t>
       </w:r>
     </w:p>
     <w:p>
@@ -231,7 +240,7 @@
         <w:jc w:val="both"/>
       </w:pPr>
       <w:r>
-        <w:t>Generar hoy la consulta del RUNT de la placa NSX651 desde la entidad y solicitar al organismo de tránsito de Cáqueza el certificado de tradición. La defensa de la propiedad es registral.</w:t>
+        <w:t>Consulta del RUNT de la placa NSX651 generada desde la entidad, con fecha visible, y solicitud radicada del certificado de tradición ante la Secretaría de Tránsito y Movilidad de Cundinamarca, sede Cáqueza. Revisar el formulario de traspaso del 30 de enero de 2026 para identificar al tradente. La defensa de la propiedad es registral.</w:t>
       </w:r>
     </w:p>
     <w:p>
@@ -240,7 +249,7 @@
         <w:jc w:val="both"/>
       </w:pPr>
       <w:r>
-        <w:t>Exigir a la contratista aclaración escrita de la fecha del contrato de compraventa (29 de abril de 2025, con placa asignada el 9 de mayo de 2025). No anexarlo sin esa aclaración; la respuesta del contratista se remite "en los términos recibidos".</w:t>
+        <w:t>Requerir hoy a la contratista, por oficio de Gerencia y correo con constancia, plazo un día hábil: aclaración escrita de la fecha del contrato de compraventa (29 de abril de 2025, con placa asignada el 9 de mayo de 2025), copia del formulario de traspaso o declaración de la vendedora, aclaración o nota de ajuste del dato de modelo de la factura FEI2168, ficha técnica del fabricante (línea, año-modelo, tracción) y acreditación del estado del vehículo a la entrega. Nunca aceptar un contrato con la fecha corregida en reemplazo del original.</w:t>
       </w:r>
     </w:p>
     <w:p>
@@ -249,7 +258,7 @@
         <w:jc w:val="both"/>
       </w:pPr>
       <w:r>
-        <w:t>Suscribir hoy, con fecha de hoy, el acta de recibo a satisfacción (y de liquidación, si el contrato la previó) firmada por la supervisora, el Líder de Almacén y, si es posible, la contratista, con placa, VIN, motor, kilometraje y ubicación.</w:t>
+        <w:t>Confirmar en la minuta, los estudios previos y la factura FEI2168 si dicen "modelo 2026", "nuevo" o "sin matricular", y si exigen tracción 4x4 (confrontar con la ficha técnica de la línea BJ1037V3KAV-1A; si exige 4x4 y el vehículo es 4x2, tratarlo aparte con la Gerencia antes de radicar). Decide el literal h).</w:t>
       </w:r>
     </w:p>
     <w:p>
@@ -258,7 +267,25 @@
         <w:jc w:val="both"/>
       </w:pPr>
       <w:r>
-        <w:t>Certificación de la supervisora, con fecha de hoy, sobre los elementos recibidos el 22 de enero de 2026 y la idoneidad de la lámpara. Lote y vencimiento de las tres bolsas de lactato.</w:t>
+        <w:t>Cotización escrita de un concesionario FOTON del precio a diciembre de 2025 de una ambulancia TAB equivalente, modelos 2025 y 2026, con carrozado y dotación. Decide la Variante A o B del literal h).</w:t>
+      </w:r>
+    </w:p>
+    <w:p>
+      <w:pPr>
+        <w:pStyle w:val="ListBullet"/>
+        <w:jc w:val="both"/>
+      </w:pPr>
+      <w:r>
+        <w:t>Acta de verificación de cumplimiento y cierre, con fecha de hoy, firmada por la supervisora y el Líder de Almacén (la contratista solo si acepta la salvedad). Sin "a entera satisfacción", "paz y salvo", "sin reclamación alguna" ni "declara cumplido el objeto". Salvedad obligatoria si se incluye h): "Se deja constancia de que la factura FEI2168 describe el automotor como modelo 2026 y el registro automotor lo identifica como modelo 2025, con matrícula inicial del 9 de mayo de 2025. La presente acta certifica la entrega del vehículo y su dotación, su matrícula a favor de la E.S.E. dentro del plazo contractual y la verificación de las especificaciones técnicas de la Resolución 3100 de 2019; no implica aceptación de esa diferencia ni renuncia a los derechos de la E.S.E. frente a la contratista derivados del contrato y de la ley, requeridos mediante oficio del [fecha], ni a las garantías legales de saneamiento."</w:t>
+      </w:r>
+    </w:p>
+    <w:p>
+      <w:pPr>
+        <w:pStyle w:val="ListBullet"/>
+        <w:jc w:val="both"/>
+      </w:pPr>
+      <w:r>
+        <w:t>Certificación de la supervisora sobre la lámpara, con fecha de hoy y solo tras inspección física en la IPS San Cayetano. Si es una lámpara de taller sin uso asistencial, Variante 2 y requerimiento de reposición a la contratista. Lote y vencimiento de las tres bolsas de lactato.</w:t>
       </w:r>
     </w:p>
     <w:p>
@@ -276,16 +303,7 @@
         <w:jc w:val="both"/>
       </w:pPr>
       <w:r>
-        <w:t>Decisión sobre el literal h) (año-modelo): confirmar en la minuta, los estudios previos y la factura FEI2168 si dicen "modelo 2026". Si lo dicen, se recomienda incluirlo con la acción correctiva (ficha técnica, nota de ajuste a la factura, comparación de precios de mercado 2025/2026) y enviar hoy el requerimiento a la contratista. Revisar si la Resolución 1947 de 2025 exigía vehículo nuevo o condicionó los recursos.</w:t>
-      </w:r>
-    </w:p>
-    <w:p>
-      <w:pPr>
-        <w:pStyle w:val="ListBullet"/>
-        <w:jc w:val="both"/>
-      </w:pPr>
-      <w:r>
-        <w:t>Confirmar la cláusula sexta (oportunidad del pago único) y si la Resolución 1947 de 2025 exigía ejecutar los recursos en 2025; confirmar la habilitación de la ambulancia en el REPS; confirmar el dígito de verificación del NIT de la E.S.E.; verificar qué contenía exactamente el enlace enviado el 1 de octubre de 2026.</w:t>
+        <w:t>Confirmar la cláusula sexta (soportes y oportunidad del pago único) y si la Resolución 1947 de 2025 fijó plazo de ejecución o exigió vehículo nuevo (riesgo de reintegro que se maneja con el Ministerio, no en el oficio); confirmar la habilitación en el REPS; CDP y RP; inventario exacto del enlace enviado el 1 de octubre de 2026.</w:t>
       </w:r>
     </w:p>
     <w:p>
@@ -296,7 +314,7 @@
         <w:rPr>
           <w:b/>
         </w:rPr>
-        <w:t>6. Riesgos que no van en el oficio pero deben conocerse</w:t>
+        <w:t>6. Riesgos que no van en el oficio pero la Gerencia debe conocer</w:t>
       </w:r>
     </w:p>
     <w:p>
@@ -305,7 +323,7 @@
         <w:jc w:val="both"/>
       </w:pPr>
       <w:r>
-        <w:t>1056: el informe de actividades de diciembre de 2025 habla de "planeación del carrozado" de un vehículo que el RUNT registra como ambulancia desde mayo de 2025, y el pago total se hizo el 26 de diciembre de 2025, antes de la entrega del 16 de enero de 2026. El oficio lo presenta como pago único pactado con garantía vigente y entrega dentro del plazo; no se califica como anticipo.</w:t>
+        <w:t>1056: los informes GJ-FO-01 y GJ-FO-02 del 17 al 31 de diciembre de 2025 hablan de "adquisición del chasis, planeación del carrozado y trámites pendientes de matrícula" de un vehículo que el RUNT registra como ambulancia matriculada desde mayo de 2025, y el pago total se autorizó el 26 de diciembre, antes de la entrega del 16 de enero de 2026. Exposición disciplinaria de supervisora, Líder de Almacén y ordenadora del gasto. Leer el texto real, conciliar con la supervisora, no corregir ni refechar, no parafrasear en el oficio; tener lista la explicación (cláusula sexta y plazo de ejecución de la Resolución 1947, si existe) solo para pregunta del auditor.</w:t>
       </w:r>
     </w:p>
     <w:p>
@@ -314,7 +332,7 @@
         <w:jc w:val="both"/>
       </w:pPr>
       <w:r>
-        <w:t>1056: los amparos de cumplimiento y calidad están vencidos desde junio y agosto de 2026. No se menciona ni se anuncia reclamación a la aseguradora.</w:t>
+        <w:t>1056: la póliza 53-44-101042119 asegura $114.312.540,40, el 40% del contrato (30% cumplimiento y 10% calidad), cuando la cláusula novena exige 30% y 30%; el amparo de cumplimiento venció el 27 de junio de 2026 y el de calidad en agosto. Por eso el oficio ya no cita porcentajes ni vigencia de la póliza y no anuncia reclamación a la aseguradora. Acción correctiva para el plan de mejoramiento: verificar amparos contra la minuta antes de aprobar.</w:t>
       </w:r>
     </w:p>
     <w:p>
@@ -323,7 +341,16 @@
         <w:jc w:val="both"/>
       </w:pPr>
       <w:r>
-        <w:t>1056: el contratista afirma que la ambulancia "estaba en el mercado para vender" y la compró a una persona natural por $260.000.000. No se adopta esa narrativa ni se citan precios de la cadena.</w:t>
+        <w:t>1056: el contrato Colón–Import Medical dice precio $260.000.000 de contado, superior a la base facturada a la E.S.E. ($240.152.396), y modelo 2025; el contratista afirma que la ambulancia "estaba en el mercado para vender". No se adopta esa narrativa ni se comenta el precio. Si Import Medical nunca fue propietaria inscrita, la venta de cosa ajena es válida (Código de Comercio, artículo 907) y la tradición la hizo la propietaria inscrita a instancia de la vendedora.</w:t>
+      </w:r>
+    </w:p>
+    <w:p>
+      <w:pPr>
+        <w:pStyle w:val="ListBullet"/>
+        <w:jc w:val="both"/>
+      </w:pPr>
+      <w:r>
+        <w:t>1056: radicado 03392 del 24 de diciembre de 2025 anterior a la factura del 26: explicar con la fecha de validación DIAN de la factura electrónica, solo si lo preguntan.</w:t>
       </w:r>
     </w:p>
     <w:p>
@@ -350,7 +377,7 @@
         <w:jc w:val="both"/>
       </w:pPr>
       <w:r>
-        <w:t>Los tres: la numeración de las causales del Manual (29.2.x en la Resolución 002 de 2023; 30.2.x en los contratos) y la vigencia de la Resolución 143 de 2025 deben unificarse en todos los documentos que se radiquen.</w:t>
+        <w:t>Los tres: la numeración de las causales del Manual (29.2.x en la Resolución 002 de 2023; 30.2.x en los contratos) y la vigencia de la Resolución 143 de 2025 deben unificarse en todos los documentos que se radiquen. El F12 del 1056: verificar cómo se rindió la casilla de ofertas; sostiene o desvirtúa la posición del 1058.</w:t>
       </w:r>
     </w:p>
     <w:sectPr>

</xml_diff>